<commit_message>
small changes on the IDs
</commit_message>
<xml_diff>
--- a/Takudzwanashe__Musere_GT.docx
+++ b/Takudzwanashe__Musere_GT.docx
@@ -9,312 +9,8 @@
           <w:spacing w:val="-2"/>
         </w:rPr>
       </w:pPr>
-    </w:p>
-    <w:p>
-      <w:pPr>
-        <w:pStyle w:val="Title"/>
-        <w:rPr>
-          <w:spacing w:val="-2"/>
-        </w:rPr>
-      </w:pPr>
-    </w:p>
-    <w:p>
-      <w:pPr>
-        <w:rPr>
-          <w:b/>
-          <w:bCs/>
-          <w:sz w:val="48"/>
-        </w:rPr>
-      </w:pPr>
-      <w:r>
-        <w:rPr>
-          <w:b/>
-          <w:bCs/>
-          <w:sz w:val="48"/>
-        </w:rPr>
-        <w:t>Application Letter</w:t>
-      </w:r>
-    </w:p>
-    <w:p>
-      <w:pPr>
-        <w:spacing w:line="360" w:lineRule="auto"/>
-      </w:pPr>
-      <w:r>
-        <w:t>​</w:t>
-      </w:r>
-      <w:proofErr w:type="spellStart"/>
-      <w:r>
-        <w:t>Takudzwanashe</w:t>
-      </w:r>
-      <w:proofErr w:type="spellEnd"/>
-      <w:r>
-        <w:t xml:space="preserve"> </w:t>
-      </w:r>
-      <w:proofErr w:type="spellStart"/>
-      <w:r>
-        <w:t>Musere</w:t>
-      </w:r>
-      <w:proofErr w:type="spellEnd"/>
-    </w:p>
-    <w:p>
-      <w:pPr>
-        <w:spacing w:line="360" w:lineRule="auto"/>
-      </w:pPr>
-      <w:r>
-        <w:t>0775 649 488</w:t>
-      </w:r>
-    </w:p>
-    <w:p>
-      <w:pPr>
-        <w:spacing w:line="360" w:lineRule="auto"/>
-      </w:pPr>
-      <w:r>
-        <w:t xml:space="preserve">takudzwamusere@gmail.com </w:t>
-      </w:r>
-    </w:p>
-    <w:p>
-      <w:pPr>
-        <w:spacing w:line="360" w:lineRule="auto"/>
-      </w:pPr>
-    </w:p>
-    <w:p>
-      <w:pPr>
-        <w:spacing w:line="360" w:lineRule="auto"/>
-      </w:pPr>
-      <w:r>
-        <w:t>​</w:t>
-      </w:r>
-      <w:r>
-        <w:t>4</w:t>
-      </w:r>
-      <w:r>
-        <w:t xml:space="preserve"> June</w:t>
-      </w:r>
-      <w:r>
-        <w:t xml:space="preserve"> 2026</w:t>
-      </w:r>
-    </w:p>
-    <w:p>
-      <w:pPr>
-        <w:spacing w:line="360" w:lineRule="auto"/>
-      </w:pPr>
-      <w:r>
-        <w:t>Dear Sir/Madam,</w:t>
-      </w:r>
-    </w:p>
-    <w:p>
-      <w:pPr>
-        <w:spacing w:line="360" w:lineRule="auto"/>
-      </w:pPr>
-    </w:p>
-    <w:p>
-      <w:pPr>
-        <w:spacing w:line="360" w:lineRule="auto"/>
-      </w:pPr>
-      <w:r>
-        <w:t>​</w:t>
-      </w:r>
-      <w:r>
-        <w:t>Dear Hiring Manager,</w:t>
-      </w:r>
-    </w:p>
-    <w:p>
-      <w:pPr>
-        <w:spacing w:line="360" w:lineRule="auto"/>
-        <w:rPr>
-          <w:b/>
-        </w:rPr>
-      </w:pPr>
-      <w:r>
-        <w:rPr>
-          <w:b/>
-        </w:rPr>
-        <w:t>RE: Application for the Service Desk Analyst (Grade C5) Position</w:t>
-      </w:r>
-    </w:p>
-    <w:p>
-      <w:pPr>
-        <w:spacing w:line="360" w:lineRule="auto"/>
-      </w:pPr>
-    </w:p>
-    <w:p>
-      <w:pPr>
-        <w:spacing w:line="360" w:lineRule="auto"/>
-      </w:pPr>
-      <w:r>
-        <w:t>I am writing to express my interest in the Service Desk Analyst position advertised by ZINARA. I recently completed a Bachelor of Science degree in Information Technology and am eager to apply my technical knowledge and skills in a professional environment.</w:t>
-      </w:r>
-    </w:p>
-    <w:p>
-      <w:pPr>
-        <w:spacing w:line="360" w:lineRule="auto"/>
-      </w:pPr>
-    </w:p>
-    <w:p>
-      <w:pPr>
-        <w:spacing w:line="360" w:lineRule="auto"/>
-      </w:pPr>
-      <w:r>
-        <w:t>During my industrial attachment, I gained practical experience in IT support, including network maintenance, troubleshooting hardware an</w:t>
-      </w:r>
-      <w:r>
-        <w:t>d software issues, user support</w:t>
-      </w:r>
-      <w:r>
-        <w:t xml:space="preserve"> and maintaining computer systems. This experience strengthened my problem-solving, communication, and customer service skills, which I believe are essential for a Service Desk Analyst role.</w:t>
-      </w:r>
-    </w:p>
-    <w:p>
-      <w:pPr>
-        <w:spacing w:line="360" w:lineRule="auto"/>
-      </w:pPr>
-    </w:p>
-    <w:p>
-      <w:pPr>
-        <w:spacing w:line="360" w:lineRule="auto"/>
-      </w:pPr>
-      <w:r>
-        <w:t>I am a hardworking, adaptable and enthusiastic individual with a strong passion for information technology. I am confident that my academic background and practical experience would enable me to contribute positively to your organization while continuing to develop my professional skills.</w:t>
-      </w:r>
-    </w:p>
-    <w:p>
-      <w:pPr>
-        <w:spacing w:line="360" w:lineRule="auto"/>
-      </w:pPr>
-    </w:p>
-    <w:p>
-      <w:pPr>
-        <w:spacing w:line="360" w:lineRule="auto"/>
-      </w:pPr>
-      <w:r>
-        <w:t>I have attached my curriculum vitae and supporting documents for your consideration. I would welcome the opportunity to discuss my application further and demonstrate how I can contribute to ZINARA.</w:t>
-      </w:r>
-    </w:p>
-    <w:p>
-      <w:pPr>
-        <w:spacing w:line="360" w:lineRule="auto"/>
-      </w:pPr>
-    </w:p>
-    <w:p>
-      <w:pPr>
-        <w:spacing w:line="360" w:lineRule="auto"/>
-      </w:pPr>
-      <w:r>
-        <w:t>Thank you for your time and consideration. I look forward to hearing from you.</w:t>
-      </w:r>
-    </w:p>
-    <w:p>
-      <w:pPr>
-        <w:spacing w:line="360" w:lineRule="auto"/>
-      </w:pPr>
-    </w:p>
-    <w:p>
-      <w:pPr>
-        <w:spacing w:line="360" w:lineRule="auto"/>
-      </w:pPr>
-      <w:r>
-        <w:t>Yours faithfully,</w:t>
-      </w:r>
-    </w:p>
-    <w:p>
-      <w:pPr>
-        <w:spacing w:line="360" w:lineRule="auto"/>
-      </w:pPr>
-    </w:p>
-    <w:p>
-      <w:pPr>
-        <w:spacing w:line="360" w:lineRule="auto"/>
-      </w:pPr>
-      <w:proofErr w:type="spellStart"/>
-      <w:r>
-        <w:t>Takudzwa</w:t>
-      </w:r>
-      <w:r>
-        <w:t>nashe</w:t>
-      </w:r>
       <w:bookmarkStart w:id="0" w:name="_GoBack"/>
       <w:bookmarkEnd w:id="0"/>
-      <w:proofErr w:type="spellEnd"/>
-      <w:r>
-        <w:t xml:space="preserve"> </w:t>
-      </w:r>
-      <w:proofErr w:type="spellStart"/>
-      <w:r>
-        <w:t>Musere</w:t>
-      </w:r>
-      <w:proofErr w:type="spellEnd"/>
-    </w:p>
-    <w:p>
-      <w:pPr>
-        <w:spacing w:line="360" w:lineRule="auto"/>
-        <w:rPr>
-          <w:spacing w:val="-2"/>
-        </w:rPr>
-      </w:pPr>
-    </w:p>
-    <w:p>
-      <w:pPr>
-        <w:pStyle w:val="Title"/>
-        <w:rPr>
-          <w:spacing w:val="-2"/>
-        </w:rPr>
-      </w:pPr>
-    </w:p>
-    <w:p>
-      <w:pPr>
-        <w:pStyle w:val="Title"/>
-        <w:rPr>
-          <w:spacing w:val="-2"/>
-        </w:rPr>
-      </w:pPr>
-    </w:p>
-    <w:p>
-      <w:pPr>
-        <w:pStyle w:val="Title"/>
-        <w:rPr>
-          <w:spacing w:val="-2"/>
-        </w:rPr>
-      </w:pPr>
-    </w:p>
-    <w:p>
-      <w:pPr>
-        <w:pStyle w:val="Title"/>
-        <w:rPr>
-          <w:spacing w:val="-2"/>
-        </w:rPr>
-      </w:pPr>
-    </w:p>
-    <w:p>
-      <w:pPr>
-        <w:pStyle w:val="Title"/>
-        <w:rPr>
-          <w:spacing w:val="-2"/>
-        </w:rPr>
-      </w:pPr>
-    </w:p>
-    <w:p>
-      <w:pPr>
-        <w:pStyle w:val="Title"/>
-        <w:rPr>
-          <w:spacing w:val="-2"/>
-        </w:rPr>
-      </w:pPr>
-    </w:p>
-    <w:p>
-      <w:pPr>
-        <w:pStyle w:val="Title"/>
-        <w:rPr>
-          <w:spacing w:val="-2"/>
-        </w:rPr>
-      </w:pPr>
-    </w:p>
-    <w:p>
-      <w:pPr>
-        <w:pStyle w:val="Title"/>
-        <w:rPr>
-          <w:spacing w:val="-2"/>
-        </w:rPr>
-      </w:pPr>
       <w:r>
         <w:rPr>
           <w:spacing w:val="-2"/>
@@ -2502,7 +2198,6 @@
         <w:ind w:left="719" w:hanging="359"/>
       </w:pPr>
       <w:r>
-        <w:lastRenderedPageBreak/>
         <w:t>Fast</w:t>
       </w:r>
       <w:r>

</xml_diff>